<commit_message>
docs: actualización del plan de instalación
</commit_message>
<xml_diff>
--- a/7_Trimestre/Documentación/Planes/Plan de Instalación.docx
+++ b/7_Trimestre/Documentación/Planes/Plan de Instalación.docx
@@ -555,15 +555,7 @@
                 <w:sz w:val="24"/>
                 <w:szCs w:val="24"/>
               </w:rPr>
-              <w:t>2</w:t>
-            </w:r>
-            <w:r>
-              <w:rPr>
-                <w:rFonts w:ascii="Times New Roman" w:eastAsia="Times New Roman" w:hAnsi="Times New Roman" w:cs="Times New Roman"/>
-                <w:sz w:val="24"/>
-                <w:szCs w:val="24"/>
-              </w:rPr>
-              <w:t>.0</w:t>
+              <w:t>2.0</w:t>
             </w:r>
           </w:p>
         </w:tc>
@@ -2199,7 +2191,25 @@
           <w:sz w:val="24"/>
           <w:szCs w:val="24"/>
         </w:rPr>
-        <w:t>Conectividad a internet mediante red Wi-Fi o datos móviles.</w:t>
+        <w:t xml:space="preserve">Conectividad a internet mediante red </w:t>
+      </w:r>
+      <w:proofErr w:type="spellStart"/>
+      <w:r>
+        <w:rPr>
+          <w:rFonts w:ascii="Times New Roman" w:eastAsia="Times New Roman" w:hAnsi="Times New Roman" w:cs="Times New Roman"/>
+          <w:sz w:val="24"/>
+          <w:szCs w:val="24"/>
+        </w:rPr>
+        <w:t>Wi</w:t>
+      </w:r>
+      <w:proofErr w:type="spellEnd"/>
+      <w:r>
+        <w:rPr>
+          <w:rFonts w:ascii="Times New Roman" w:eastAsia="Times New Roman" w:hAnsi="Times New Roman" w:cs="Times New Roman"/>
+          <w:sz w:val="24"/>
+          <w:szCs w:val="24"/>
+        </w:rPr>
+        <w:t>-Fi o datos móviles.</w:t>
       </w:r>
     </w:p>
     <w:p>
@@ -2516,7 +2526,15 @@
       </w:r>
       <w:r>
         <w:br/>
-        <w:t>Inicio del plan: 01 de Abril de 2026</w:t>
+        <w:t xml:space="preserve">Inicio del plan: 01 de </w:t>
+      </w:r>
+      <w:proofErr w:type="gramStart"/>
+      <w:r>
+        <w:t>Abril</w:t>
+      </w:r>
+      <w:proofErr w:type="gramEnd"/>
+      <w:r>
+        <w:t xml:space="preserve"> de 2026</w:t>
       </w:r>
       <w:r>
         <w:br/>
@@ -4005,7 +4023,10 @@
           <w:szCs w:val="48"/>
         </w:rPr>
       </w:pPr>
-      <w:r>
+    </w:p>
+    <w:p>
+      <w:pPr>
+        <w:spacing w:before="280" w:after="280" w:line="240" w:lineRule="auto"/>
         <w:rPr>
           <w:rFonts w:ascii="Times New Roman" w:eastAsia="Times New Roman" w:hAnsi="Times New Roman" w:cs="Times New Roman"/>
           <w:b/>
@@ -4013,30 +4034,80 @@
           <w:sz w:val="48"/>
           <w:szCs w:val="48"/>
         </w:rPr>
-        <w:t>13. Diagrama de instalación del sistema</w:t>
-      </w:r>
-    </w:p>
-    <w:p>
-      <w:pPr>
-        <w:spacing w:before="280" w:after="280" w:line="240" w:lineRule="auto"/>
-        <w:rPr>
-          <w:rFonts w:ascii="Times New Roman" w:eastAsia="Times New Roman" w:hAnsi="Times New Roman" w:cs="Times New Roman"/>
-          <w:sz w:val="24"/>
-          <w:szCs w:val="24"/>
+      </w:pPr>
+    </w:p>
+    <w:p>
+      <w:pPr>
+        <w:spacing w:before="280" w:after="280" w:line="240" w:lineRule="auto"/>
+        <w:rPr>
+          <w:rFonts w:ascii="Times New Roman" w:eastAsia="Times New Roman" w:hAnsi="Times New Roman" w:cs="Times New Roman"/>
+          <w:b/>
+          <w:bCs/>
+          <w:sz w:val="48"/>
+          <w:szCs w:val="48"/>
+        </w:rPr>
+      </w:pPr>
+    </w:p>
+    <w:p>
+      <w:pPr>
+        <w:spacing w:before="280" w:after="280" w:line="240" w:lineRule="auto"/>
+        <w:rPr>
+          <w:rFonts w:ascii="Times New Roman" w:eastAsia="Times New Roman" w:hAnsi="Times New Roman" w:cs="Times New Roman"/>
+          <w:b/>
+          <w:bCs/>
+          <w:sz w:val="48"/>
+          <w:szCs w:val="48"/>
+        </w:rPr>
+      </w:pPr>
+    </w:p>
+    <w:p>
+      <w:pPr>
+        <w:spacing w:before="280" w:after="280" w:line="240" w:lineRule="auto"/>
+        <w:rPr>
+          <w:rFonts w:ascii="Times New Roman" w:eastAsia="Times New Roman" w:hAnsi="Times New Roman" w:cs="Times New Roman"/>
+          <w:b/>
+          <w:bCs/>
+          <w:sz w:val="48"/>
+          <w:szCs w:val="48"/>
+        </w:rPr>
+      </w:pPr>
+    </w:p>
+    <w:p>
+      <w:pPr>
+        <w:spacing w:before="280" w:after="280" w:line="240" w:lineRule="auto"/>
+        <w:rPr>
+          <w:rFonts w:ascii="Times New Roman" w:eastAsia="Times New Roman" w:hAnsi="Times New Roman" w:cs="Times New Roman"/>
+          <w:b/>
+          <w:bCs/>
+          <w:sz w:val="48"/>
+          <w:szCs w:val="48"/>
+        </w:rPr>
+      </w:pPr>
+    </w:p>
+    <w:p>
+      <w:pPr>
+        <w:spacing w:before="280" w:after="280" w:line="240" w:lineRule="auto"/>
+        <w:rPr>
+          <w:rFonts w:ascii="Times New Roman" w:eastAsia="Times New Roman" w:hAnsi="Times New Roman" w:cs="Times New Roman"/>
+          <w:b/>
+          <w:bCs/>
+          <w:sz w:val="48"/>
+          <w:szCs w:val="48"/>
         </w:rPr>
       </w:pPr>
       <w:r>
         <w:rPr>
           <w:noProof/>
         </w:rPr>
+        <w:lastRenderedPageBreak/>
         <w:drawing>
-          <wp:anchor distT="0" distB="0" distL="114300" distR="114300" simplePos="0" relativeHeight="251660288" behindDoc="0" locked="0" layoutInCell="1" hidden="0" allowOverlap="1" wp14:anchorId="549C1087" wp14:editId="1C0EBD20">
+          <wp:anchor distT="0" distB="0" distL="114300" distR="114300" simplePos="0" relativeHeight="251660288" behindDoc="0" locked="0" layoutInCell="1" hidden="0" allowOverlap="1" wp14:anchorId="549C1087" wp14:editId="56215F23">
             <wp:simplePos x="0" y="0"/>
             <wp:positionH relativeFrom="column">
-              <wp:posOffset>1767840</wp:posOffset>
+              <wp:posOffset>1748790</wp:posOffset>
             </wp:positionH>
             <wp:positionV relativeFrom="paragraph">
-              <wp:posOffset>7620</wp:posOffset>
+              <wp:posOffset>478790</wp:posOffset>
             </wp:positionV>
             <wp:extent cx="1447800" cy="4257675"/>
             <wp:effectExtent l="0" t="0" r="0" b="0"/>
@@ -4079,6 +4150,26 @@
           </wp:anchor>
         </w:drawing>
       </w:r>
+      <w:r>
+        <w:rPr>
+          <w:rFonts w:ascii="Times New Roman" w:eastAsia="Times New Roman" w:hAnsi="Times New Roman" w:cs="Times New Roman"/>
+          <w:b/>
+          <w:bCs/>
+          <w:sz w:val="48"/>
+          <w:szCs w:val="48"/>
+        </w:rPr>
+        <w:t>13. Diagrama de instalación del sistema</w:t>
+      </w:r>
+    </w:p>
+    <w:p>
+      <w:pPr>
+        <w:spacing w:before="280" w:after="280" w:line="240" w:lineRule="auto"/>
+        <w:rPr>
+          <w:rFonts w:ascii="Times New Roman" w:eastAsia="Times New Roman" w:hAnsi="Times New Roman" w:cs="Times New Roman"/>
+          <w:sz w:val="24"/>
+          <w:szCs w:val="24"/>
+        </w:rPr>
+      </w:pPr>
     </w:p>
     <w:p>
       <w:pPr>
@@ -4525,6 +4616,7 @@
           <w:sz w:val="24"/>
           <w:szCs w:val="24"/>
         </w:rPr>
+        <w:lastRenderedPageBreak/>
         <w:t>La correcta aplicación de este procedimiento permite minimizar errores durante la instalación, mejorar la experiencia del usuario y asegurar que el sistema funcione de manera estable dentro del entorno para el cual fue desarrollado.</w:t>
       </w:r>
     </w:p>

</xml_diff>